<commit_message>
SSLC Heads of Terms r3: remove post-close divisions/organization; Exos sole discretion on operations; scrub from meeting record
</commit_message>
<xml_diff>
--- a/drafts/SSLC_Board_Meeting_2026-10-13_Exos_Record.docx
+++ b/drafts/SSLC_Board_Meeting_2026-10-13_Exos_Record.docx
@@ -211,7 +211,7 @@
           <w:i w:val="0"/>
           <w:sz w:val="21"/>
         </w:rPr>
-        <w:t>•  Employees: no 4–6 year contracts; an assurance of continued employment offers is enough. At-will with for-cause terms in the definitive agreement. Markus treated separately.</w:t>
+        <w:t>•  Employees: no 4–6 year contracts; an assurance of continued employment offers is enough. At-will with for-cause terms in the definitive agreement.</w:t>
       </w:r>
     </w:p>
     <w:p>
@@ -224,7 +224,7 @@
           <w:i w:val="0"/>
           <w:sz w:val="21"/>
         </w:rPr>
-        <w:t>•  Two divisions (California center of excellence led by Markus; Texas production/automation) under one entity, not separate legal entities, which keeps earn-out measurement simple. Facility decisions post-closing; the buyer makes final calls with Markus's input.</w:t>
+        <w:t>•  Post-closing operations (organization, facilities) are the buyer's decision; SSLC does not set terms for how Exos runs the business after closing.</w:t>
       </w:r>
     </w:p>
     <w:p>

</xml_diff>